<commit_message>
Se agregan MANT-18 y MANT-19 (y MANT-10 actualizado) a docs/formatos/mantenciones
Co-Authored-By: Claude Sonnet 5.5 <noreply@anthropic.com>
</commit_message>
<xml_diff>
--- a/docs/formatos/mantenciones/MANT-10 Switchgear SE El Mauro 23 kV.docx
+++ b/docs/formatos/mantenciones/MANT-10 Switchgear SE El Mauro 23 kV.docx
@@ -141,7 +141,7 @@
           <w:u w:val="single"/>
           <w:lang w:val="en-US"/>
         </w:rPr>
-        <w:t>-3</w:t>
+        <w:t>-</w:t>
       </w:r>
       <w:r>
         <w:rPr>
@@ -152,7 +152,7 @@
           <w:u w:val="single"/>
           <w:lang w:val="en-US"/>
         </w:rPr>
-        <w:t>4</w:t>
+        <w:t>10</w:t>
       </w:r>
     </w:p>
     <w:p>
@@ -2333,21 +2333,7 @@
         <w:rPr>
           <w:sz w:val="20"/>
         </w:rPr>
-        <w:t xml:space="preserve">Verificar estado de fundas </w:t>
-      </w:r>
-      <w:proofErr w:type="spellStart"/>
-      <w:r>
-        <w:rPr>
-          <w:sz w:val="20"/>
-        </w:rPr>
-        <w:t>cobertoras</w:t>
-      </w:r>
-      <w:proofErr w:type="spellEnd"/>
-      <w:r>
-        <w:rPr>
-          <w:sz w:val="20"/>
-        </w:rPr>
-        <w:t xml:space="preserve"> de mufas 23 kV.</w:t>
+        <w:t>Verificar estado de fundas cobertoras de mufas 23 kV.</w:t>
       </w:r>
       <w:r>
         <w:rPr>
@@ -2554,21 +2540,7 @@
         <w:rPr>
           <w:sz w:val="20"/>
         </w:rPr>
-        <w:t xml:space="preserve"> de fundas </w:t>
-      </w:r>
-      <w:proofErr w:type="spellStart"/>
-      <w:r>
-        <w:rPr>
-          <w:sz w:val="20"/>
-        </w:rPr>
-        <w:t>cobertoras</w:t>
-      </w:r>
-      <w:proofErr w:type="spellEnd"/>
-      <w:r>
-        <w:rPr>
-          <w:sz w:val="20"/>
-        </w:rPr>
-        <w:t xml:space="preserve"> barras.</w:t>
+        <w:t xml:space="preserve"> de fundas cobertoras barras.</w:t>
       </w:r>
       <w:r>
         <w:rPr>
@@ -2708,14 +2680,12 @@
         </w:rPr>
         <w:t xml:space="preserve">Verificar estado general (chisporroteo, señal de coci, alta </w:t>
       </w:r>
-      <w:proofErr w:type="spellStart"/>
       <w:r>
         <w:rPr>
           <w:sz w:val="20"/>
         </w:rPr>
         <w:t>T°</w:t>
       </w:r>
-      <w:proofErr w:type="spellEnd"/>
       <w:r>
         <w:rPr>
           <w:sz w:val="20"/>

</xml_diff>